<commit_message>
bo sung minh chung hinh anh folder minhchung_image
</commit_message>
<xml_diff>
--- a/minhchung_word/22000865_NguyenNgocHien_Lab3.docx
+++ b/minhchung_word/22000865_NguyenNgocHien_Lab3.docx
@@ -16,10 +16,56 @@
           <w:sz w:val="26"/>
           <w:szCs w:val="26"/>
         </w:rPr>
+        <w:t xml:space="preserve">Github: </w:t>
+      </w:r>
+      <w:hyperlink r:id="rId6" w:history="1">
+        <w:r>
+          <w:rPr>
+            <w:rStyle w:val="Hyperlink"/>
+            <w:rFonts w:ascii="Times New Roman" w:hAnsi="Times New Roman" w:cs="Times New Roman"/>
+            <w:sz w:val="26"/>
+            <w:szCs w:val="26"/>
+          </w:rPr>
+          <w:t>https://github.com/nghstudent/22000865_Ng</w:t>
+        </w:r>
+        <w:bookmarkStart w:id="0" w:name="_GoBack"/>
+        <w:bookmarkEnd w:id="0"/>
+        <w:r>
+          <w:rPr>
+            <w:rStyle w:val="Hyperlink"/>
+            <w:rFonts w:ascii="Times New Roman" w:hAnsi="Times New Roman" w:cs="Times New Roman"/>
+            <w:sz w:val="26"/>
+            <w:szCs w:val="26"/>
+          </w:rPr>
+          <w:t>u</w:t>
+        </w:r>
+        <w:r>
+          <w:rPr>
+            <w:rStyle w:val="Hyperlink"/>
+            <w:rFonts w:ascii="Times New Roman" w:hAnsi="Times New Roman" w:cs="Times New Roman"/>
+            <w:sz w:val="26"/>
+            <w:szCs w:val="26"/>
+          </w:rPr>
+          <w:t>yenNgocHien_CNM/tree/tuan02</w:t>
+        </w:r>
+      </w:hyperlink>
+    </w:p>
+    <w:p>
+      <w:pPr>
+        <w:rPr>
+          <w:rFonts w:ascii="Times New Roman" w:hAnsi="Times New Roman" w:cs="Times New Roman"/>
+          <w:sz w:val="26"/>
+          <w:szCs w:val="26"/>
+        </w:rPr>
+      </w:pPr>
+      <w:r>
+        <w:rPr>
+          <w:rFonts w:ascii="Times New Roman" w:hAnsi="Times New Roman" w:cs="Times New Roman"/>
+          <w:sz w:val="26"/>
+          <w:szCs w:val="26"/>
+        </w:rPr>
         <w:t>5. Các chức năng bắt buộc (CRUD)</w:t>
       </w:r>
-      <w:bookmarkStart w:id="0" w:name="_GoBack"/>
-      <w:bookmarkEnd w:id="0"/>
     </w:p>
     <w:p>
       <w:pPr>
@@ -150,90 +196,6 @@
             <wp:extent cx="5943600" cy="3341370"/>
             <wp:effectExtent l="0" t="0" r="0" b="0"/>
             <wp:docPr id="1" name="Picture 1"/>
-            <wp:cNvGraphicFramePr>
-              <a:graphicFrameLocks xmlns:a="http://schemas.openxmlformats.org/drawingml/2006/main" noChangeAspect="1"/>
-            </wp:cNvGraphicFramePr>
-            <a:graphic xmlns:a="http://schemas.openxmlformats.org/drawingml/2006/main">
-              <a:graphicData uri="http://schemas.openxmlformats.org/drawingml/2006/picture">
-                <pic:pic xmlns:pic="http://schemas.openxmlformats.org/drawingml/2006/picture">
-                  <pic:nvPicPr>
-                    <pic:cNvPr id="1" name=""/>
-                    <pic:cNvPicPr/>
-                  </pic:nvPicPr>
-                  <pic:blipFill>
-                    <a:blip r:embed="rId6"/>
-                    <a:stretch>
-                      <a:fillRect/>
-                    </a:stretch>
-                  </pic:blipFill>
-                  <pic:spPr>
-                    <a:xfrm>
-                      <a:off x="0" y="0"/>
-                      <a:ext cx="5943600" cy="3341370"/>
-                    </a:xfrm>
-                    <a:prstGeom prst="rect">
-                      <a:avLst/>
-                    </a:prstGeom>
-                  </pic:spPr>
-                </pic:pic>
-              </a:graphicData>
-            </a:graphic>
-          </wp:inline>
-        </w:drawing>
-      </w:r>
-    </w:p>
-    <w:p>
-      <w:pPr>
-        <w:rPr>
-          <w:rFonts w:ascii="Times New Roman" w:hAnsi="Times New Roman" w:cs="Times New Roman"/>
-          <w:sz w:val="26"/>
-          <w:szCs w:val="26"/>
-        </w:rPr>
-      </w:pPr>
-      <w:r>
-        <w:rPr>
-          <w:rFonts w:ascii="Times New Roman" w:hAnsi="Times New Roman" w:cs="Times New Roman"/>
-          <w:sz w:val="26"/>
-          <w:szCs w:val="26"/>
-        </w:rPr>
-        <w:br w:type="page"/>
-      </w:r>
-    </w:p>
-    <w:p>
-      <w:pPr>
-        <w:rPr>
-          <w:rFonts w:ascii="Times New Roman" w:hAnsi="Times New Roman" w:cs="Times New Roman"/>
-          <w:sz w:val="26"/>
-          <w:szCs w:val="26"/>
-        </w:rPr>
-      </w:pPr>
-      <w:r>
-        <w:rPr>
-          <w:rFonts w:ascii="Times New Roman" w:hAnsi="Times New Roman" w:cs="Times New Roman"/>
-          <w:sz w:val="26"/>
-          <w:szCs w:val="26"/>
-        </w:rPr>
-        <w:lastRenderedPageBreak/>
-        <w:t>B2: Trang thêm sản phẩm</w:t>
-      </w:r>
-    </w:p>
-    <w:p>
-      <w:pPr>
-        <w:rPr>
-          <w:rFonts w:ascii="Times New Roman" w:hAnsi="Times New Roman" w:cs="Times New Roman"/>
-          <w:sz w:val="26"/>
-          <w:szCs w:val="26"/>
-        </w:rPr>
-      </w:pPr>
-      <w:r>
-        <w:rPr>
-          <w:noProof/>
-        </w:rPr>
-        <w:drawing>
-          <wp:inline distT="0" distB="0" distL="0" distR="0" wp14:anchorId="25B19707" wp14:editId="50C6A0F0">
-            <wp:extent cx="5943600" cy="3341370"/>
-            <wp:effectExtent l="0" t="0" r="0" b="0"/>
-            <wp:docPr id="2" name="Picture 2"/>
             <wp:cNvGraphicFramePr>
               <a:graphicFrameLocks xmlns:a="http://schemas.openxmlformats.org/drawingml/2006/main" noChangeAspect="1"/>
             </wp:cNvGraphicFramePr>
@@ -274,22 +236,31 @@
           <w:szCs w:val="26"/>
         </w:rPr>
       </w:pPr>
-    </w:p>
-    <w:p>
-      <w:pPr>
-        <w:rPr>
-          <w:rFonts w:ascii="Times New Roman" w:hAnsi="Times New Roman" w:cs="Times New Roman"/>
-          <w:sz w:val="26"/>
-          <w:szCs w:val="26"/>
-        </w:rPr>
-      </w:pPr>
-      <w:r>
-        <w:rPr>
-          <w:rFonts w:ascii="Times New Roman" w:hAnsi="Times New Roman" w:cs="Times New Roman"/>
-          <w:sz w:val="26"/>
-          <w:szCs w:val="26"/>
-        </w:rPr>
-        <w:t>B3: Thêm sản phẩm</w:t>
+      <w:r>
+        <w:rPr>
+          <w:rFonts w:ascii="Times New Roman" w:hAnsi="Times New Roman" w:cs="Times New Roman"/>
+          <w:sz w:val="26"/>
+          <w:szCs w:val="26"/>
+        </w:rPr>
+        <w:br w:type="page"/>
+      </w:r>
+    </w:p>
+    <w:p>
+      <w:pPr>
+        <w:rPr>
+          <w:rFonts w:ascii="Times New Roman" w:hAnsi="Times New Roman" w:cs="Times New Roman"/>
+          <w:sz w:val="26"/>
+          <w:szCs w:val="26"/>
+        </w:rPr>
+      </w:pPr>
+      <w:r>
+        <w:rPr>
+          <w:rFonts w:ascii="Times New Roman" w:hAnsi="Times New Roman" w:cs="Times New Roman"/>
+          <w:sz w:val="26"/>
+          <w:szCs w:val="26"/>
+        </w:rPr>
+        <w:lastRenderedPageBreak/>
+        <w:t>B2: Trang thêm sản phẩm</w:t>
       </w:r>
     </w:p>
     <w:p>
@@ -305,10 +276,10 @@
           <w:noProof/>
         </w:rPr>
         <w:drawing>
-          <wp:inline distT="0" distB="0" distL="0" distR="0" wp14:anchorId="3928F834" wp14:editId="2A5BE908">
+          <wp:inline distT="0" distB="0" distL="0" distR="0" wp14:anchorId="25B19707" wp14:editId="50C6A0F0">
             <wp:extent cx="5943600" cy="3341370"/>
             <wp:effectExtent l="0" t="0" r="0" b="0"/>
-            <wp:docPr id="3" name="Picture 3"/>
+            <wp:docPr id="2" name="Picture 2"/>
             <wp:cNvGraphicFramePr>
               <a:graphicFrameLocks xmlns:a="http://schemas.openxmlformats.org/drawingml/2006/main" noChangeAspect="1"/>
             </wp:cNvGraphicFramePr>
@@ -364,8 +335,7 @@
           <w:sz w:val="26"/>
           <w:szCs w:val="26"/>
         </w:rPr>
-        <w:lastRenderedPageBreak/>
-        <w:t>B4: Sau khi thêm sản phẩm</w:t>
+        <w:t>B3: Thêm sản phẩm</w:t>
       </w:r>
     </w:p>
     <w:p>
@@ -381,10 +351,10 @@
           <w:noProof/>
         </w:rPr>
         <w:drawing>
-          <wp:inline distT="0" distB="0" distL="0" distR="0" wp14:anchorId="0B5E3C49" wp14:editId="64F3D791">
+          <wp:inline distT="0" distB="0" distL="0" distR="0" wp14:anchorId="3928F834" wp14:editId="2A5BE908">
             <wp:extent cx="5943600" cy="3341370"/>
             <wp:effectExtent l="0" t="0" r="0" b="0"/>
-            <wp:docPr id="5" name="Picture 5"/>
+            <wp:docPr id="3" name="Picture 3"/>
             <wp:cNvGraphicFramePr>
               <a:graphicFrameLocks xmlns:a="http://schemas.openxmlformats.org/drawingml/2006/main" noChangeAspect="1"/>
             </wp:cNvGraphicFramePr>
@@ -425,14 +395,6 @@
           <w:szCs w:val="26"/>
         </w:rPr>
       </w:pPr>
-      <w:r>
-        <w:rPr>
-          <w:rFonts w:ascii="Times New Roman" w:hAnsi="Times New Roman" w:cs="Times New Roman"/>
-          <w:sz w:val="26"/>
-          <w:szCs w:val="26"/>
-        </w:rPr>
-        <w:br w:type="page"/>
-      </w:r>
     </w:p>
     <w:p>
       <w:pPr>
@@ -449,59 +411,7 @@
           <w:szCs w:val="26"/>
         </w:rPr>
         <w:lastRenderedPageBreak/>
-        <w:t>5.2. Read – Xem danh sách sản phẩm</w:t>
-      </w:r>
-    </w:p>
-    <w:p>
-      <w:pPr>
-        <w:rPr>
-          <w:rFonts w:ascii="Times New Roman" w:hAnsi="Times New Roman" w:cs="Times New Roman"/>
-          <w:sz w:val="26"/>
-          <w:szCs w:val="26"/>
-        </w:rPr>
-      </w:pPr>
-      <w:r>
-        <w:rPr>
-          <w:rFonts w:ascii="Times New Roman" w:hAnsi="Times New Roman" w:cs="Times New Roman"/>
-          <w:sz w:val="26"/>
-          <w:szCs w:val="26"/>
-        </w:rPr>
-        <w:t>•</w:t>
-      </w:r>
-      <w:r>
-        <w:rPr>
-          <w:rFonts w:ascii="Times New Roman" w:hAnsi="Times New Roman" w:cs="Times New Roman"/>
-          <w:sz w:val="26"/>
-          <w:szCs w:val="26"/>
-        </w:rPr>
-        <w:tab/>
-        <w:t>Hiển thị danh sách sản phẩm dưới dạng bảng</w:t>
-      </w:r>
-    </w:p>
-    <w:p>
-      <w:pPr>
-        <w:rPr>
-          <w:rFonts w:ascii="Times New Roman" w:hAnsi="Times New Roman" w:cs="Times New Roman"/>
-          <w:sz w:val="26"/>
-          <w:szCs w:val="26"/>
-        </w:rPr>
-      </w:pPr>
-      <w:r>
-        <w:rPr>
-          <w:rFonts w:ascii="Times New Roman" w:hAnsi="Times New Roman" w:cs="Times New Roman"/>
-          <w:sz w:val="26"/>
-          <w:szCs w:val="26"/>
-        </w:rPr>
-        <w:t>•</w:t>
-      </w:r>
-      <w:r>
-        <w:rPr>
-          <w:rFonts w:ascii="Times New Roman" w:hAnsi="Times New Roman" w:cs="Times New Roman"/>
-          <w:sz w:val="26"/>
-          <w:szCs w:val="26"/>
-        </w:rPr>
-        <w:tab/>
-        <w:t>Hiển thị hình ảnh, tên, giá, số lượng tồn kho</w:t>
+        <w:t>B4: Sau khi thêm sản phẩm</w:t>
       </w:r>
     </w:p>
     <w:p>
@@ -517,263 +427,10 @@
           <w:noProof/>
         </w:rPr>
         <w:drawing>
-          <wp:inline distT="0" distB="0" distL="0" distR="0" wp14:anchorId="54D7485E" wp14:editId="189491E6">
+          <wp:inline distT="0" distB="0" distL="0" distR="0" wp14:anchorId="0B5E3C49" wp14:editId="64F3D791">
             <wp:extent cx="5943600" cy="3341370"/>
             <wp:effectExtent l="0" t="0" r="0" b="0"/>
-            <wp:docPr id="6" name="Picture 6"/>
-            <wp:cNvGraphicFramePr>
-              <a:graphicFrameLocks xmlns:a="http://schemas.openxmlformats.org/drawingml/2006/main" noChangeAspect="1"/>
-            </wp:cNvGraphicFramePr>
-            <a:graphic xmlns:a="http://schemas.openxmlformats.org/drawingml/2006/main">
-              <a:graphicData uri="http://schemas.openxmlformats.org/drawingml/2006/picture">
-                <pic:pic xmlns:pic="http://schemas.openxmlformats.org/drawingml/2006/picture">
-                  <pic:nvPicPr>
-                    <pic:cNvPr id="1" name=""/>
-                    <pic:cNvPicPr/>
-                  </pic:nvPicPr>
-                  <pic:blipFill>
-                    <a:blip r:embed="rId9"/>
-                    <a:stretch>
-                      <a:fillRect/>
-                    </a:stretch>
-                  </pic:blipFill>
-                  <pic:spPr>
-                    <a:xfrm>
-                      <a:off x="0" y="0"/>
-                      <a:ext cx="5943600" cy="3341370"/>
-                    </a:xfrm>
-                    <a:prstGeom prst="rect">
-                      <a:avLst/>
-                    </a:prstGeom>
-                  </pic:spPr>
-                </pic:pic>
-              </a:graphicData>
-            </a:graphic>
-          </wp:inline>
-        </w:drawing>
-      </w:r>
-    </w:p>
-    <w:p>
-      <w:pPr>
-        <w:rPr>
-          <w:rFonts w:ascii="Times New Roman" w:hAnsi="Times New Roman" w:cs="Times New Roman"/>
-          <w:sz w:val="26"/>
-          <w:szCs w:val="26"/>
-        </w:rPr>
-      </w:pPr>
-      <w:r>
-        <w:rPr>
-          <w:rFonts w:ascii="Times New Roman" w:hAnsi="Times New Roman" w:cs="Times New Roman"/>
-          <w:sz w:val="26"/>
-          <w:szCs w:val="26"/>
-        </w:rPr>
-        <w:br w:type="page"/>
-      </w:r>
-    </w:p>
-    <w:p>
-      <w:pPr>
-        <w:rPr>
-          <w:rFonts w:ascii="Times New Roman" w:hAnsi="Times New Roman" w:cs="Times New Roman"/>
-          <w:sz w:val="26"/>
-          <w:szCs w:val="26"/>
-        </w:rPr>
-      </w:pPr>
-      <w:r>
-        <w:rPr>
-          <w:rFonts w:ascii="Times New Roman" w:hAnsi="Times New Roman" w:cs="Times New Roman"/>
-          <w:sz w:val="26"/>
-          <w:szCs w:val="26"/>
-        </w:rPr>
-        <w:lastRenderedPageBreak/>
-        <w:t>5.3. Update – Cập nhật sản phẩm</w:t>
-      </w:r>
-    </w:p>
-    <w:p>
-      <w:pPr>
-        <w:rPr>
-          <w:rFonts w:ascii="Times New Roman" w:hAnsi="Times New Roman" w:cs="Times New Roman"/>
-          <w:sz w:val="26"/>
-          <w:szCs w:val="26"/>
-        </w:rPr>
-      </w:pPr>
-      <w:r>
-        <w:rPr>
-          <w:rFonts w:ascii="Times New Roman" w:hAnsi="Times New Roman" w:cs="Times New Roman"/>
-          <w:sz w:val="26"/>
-          <w:szCs w:val="26"/>
-        </w:rPr>
-        <w:t>•</w:t>
-      </w:r>
-      <w:r>
-        <w:rPr>
-          <w:rFonts w:ascii="Times New Roman" w:hAnsi="Times New Roman" w:cs="Times New Roman"/>
-          <w:sz w:val="26"/>
-          <w:szCs w:val="26"/>
-        </w:rPr>
-        <w:tab/>
-        <w:t>Chỉnh sửa tên, giá, số lượng, hình ảnh</w:t>
-      </w:r>
-    </w:p>
-    <w:p>
-      <w:pPr>
-        <w:rPr>
-          <w:rFonts w:ascii="Times New Roman" w:hAnsi="Times New Roman" w:cs="Times New Roman"/>
-          <w:sz w:val="26"/>
-          <w:szCs w:val="26"/>
-        </w:rPr>
-      </w:pPr>
-      <w:r>
-        <w:rPr>
-          <w:rFonts w:ascii="Times New Roman" w:hAnsi="Times New Roman" w:cs="Times New Roman"/>
-          <w:sz w:val="26"/>
-          <w:szCs w:val="26"/>
-        </w:rPr>
-        <w:t>•</w:t>
-      </w:r>
-      <w:r>
-        <w:rPr>
-          <w:rFonts w:ascii="Times New Roman" w:hAnsi="Times New Roman" w:cs="Times New Roman"/>
-          <w:sz w:val="26"/>
-          <w:szCs w:val="26"/>
-        </w:rPr>
-        <w:tab/>
-        <w:t>Cập nhật dữ liệu trong DynamoDB</w:t>
-      </w:r>
-    </w:p>
-    <w:p>
-      <w:pPr>
-        <w:rPr>
-          <w:rFonts w:ascii="Times New Roman" w:hAnsi="Times New Roman" w:cs="Times New Roman"/>
-          <w:sz w:val="26"/>
-          <w:szCs w:val="26"/>
-        </w:rPr>
-      </w:pPr>
-      <w:r>
-        <w:rPr>
-          <w:rFonts w:ascii="Times New Roman" w:hAnsi="Times New Roman" w:cs="Times New Roman"/>
-          <w:sz w:val="26"/>
-          <w:szCs w:val="26"/>
-        </w:rPr>
-        <w:t>B1: Trước khi sửa</w:t>
-      </w:r>
-    </w:p>
-    <w:p>
-      <w:pPr>
-        <w:rPr>
-          <w:rFonts w:ascii="Times New Roman" w:hAnsi="Times New Roman" w:cs="Times New Roman"/>
-          <w:sz w:val="26"/>
-          <w:szCs w:val="26"/>
-        </w:rPr>
-      </w:pPr>
-      <w:r>
-        <w:rPr>
-          <w:noProof/>
-        </w:rPr>
-        <w:drawing>
-          <wp:inline distT="0" distB="0" distL="0" distR="0" wp14:anchorId="05212DCA" wp14:editId="64E63FA6">
-            <wp:extent cx="5943600" cy="3341370"/>
-            <wp:effectExtent l="0" t="0" r="0" b="0"/>
-            <wp:docPr id="8" name="Picture 8"/>
-            <wp:cNvGraphicFramePr>
-              <a:graphicFrameLocks xmlns:a="http://schemas.openxmlformats.org/drawingml/2006/main" noChangeAspect="1"/>
-            </wp:cNvGraphicFramePr>
-            <a:graphic xmlns:a="http://schemas.openxmlformats.org/drawingml/2006/main">
-              <a:graphicData uri="http://schemas.openxmlformats.org/drawingml/2006/picture">
-                <pic:pic xmlns:pic="http://schemas.openxmlformats.org/drawingml/2006/picture">
-                  <pic:nvPicPr>
-                    <pic:cNvPr id="1" name=""/>
-                    <pic:cNvPicPr/>
-                  </pic:nvPicPr>
-                  <pic:blipFill>
-                    <a:blip r:embed="rId9"/>
-                    <a:stretch>
-                      <a:fillRect/>
-                    </a:stretch>
-                  </pic:blipFill>
-                  <pic:spPr>
-                    <a:xfrm>
-                      <a:off x="0" y="0"/>
-                      <a:ext cx="5943600" cy="3341370"/>
-                    </a:xfrm>
-                    <a:prstGeom prst="rect">
-                      <a:avLst/>
-                    </a:prstGeom>
-                  </pic:spPr>
-                </pic:pic>
-              </a:graphicData>
-            </a:graphic>
-          </wp:inline>
-        </w:drawing>
-      </w:r>
-    </w:p>
-    <w:p>
-      <w:pPr>
-        <w:rPr>
-          <w:rFonts w:ascii="Times New Roman" w:hAnsi="Times New Roman" w:cs="Times New Roman"/>
-          <w:sz w:val="26"/>
-          <w:szCs w:val="26"/>
-        </w:rPr>
-      </w:pPr>
-      <w:r>
-        <w:rPr>
-          <w:rFonts w:ascii="Times New Roman" w:hAnsi="Times New Roman" w:cs="Times New Roman"/>
-          <w:sz w:val="26"/>
-          <w:szCs w:val="26"/>
-        </w:rPr>
-        <w:br w:type="page"/>
-      </w:r>
-    </w:p>
-    <w:p>
-      <w:pPr>
-        <w:rPr>
-          <w:rFonts w:ascii="Times New Roman" w:hAnsi="Times New Roman" w:cs="Times New Roman"/>
-          <w:sz w:val="26"/>
-          <w:szCs w:val="26"/>
-        </w:rPr>
-      </w:pPr>
-      <w:r>
-        <w:rPr>
-          <w:rFonts w:ascii="Times New Roman" w:hAnsi="Times New Roman" w:cs="Times New Roman"/>
-          <w:sz w:val="26"/>
-          <w:szCs w:val="26"/>
-        </w:rPr>
-        <w:lastRenderedPageBreak/>
-        <w:t xml:space="preserve">B2: </w:t>
-      </w:r>
-      <w:r>
-        <w:rPr>
-          <w:rFonts w:ascii="Times New Roman" w:hAnsi="Times New Roman" w:cs="Times New Roman"/>
-          <w:sz w:val="26"/>
-          <w:szCs w:val="26"/>
-        </w:rPr>
-        <w:t>Chỉnh s</w:t>
-      </w:r>
-      <w:r>
-        <w:rPr>
-          <w:rFonts w:ascii="Times New Roman" w:hAnsi="Times New Roman" w:cs="Times New Roman"/>
-          <w:sz w:val="26"/>
-          <w:szCs w:val="26"/>
-        </w:rPr>
-        <w:t>ửa</w:t>
-      </w:r>
-    </w:p>
-    <w:p>
-      <w:pPr>
-        <w:rPr>
-          <w:rFonts w:ascii="Times New Roman" w:hAnsi="Times New Roman" w:cs="Times New Roman"/>
-          <w:sz w:val="26"/>
-          <w:szCs w:val="26"/>
-        </w:rPr>
-      </w:pPr>
-      <w:r>
-        <w:rPr>
-          <w:noProof/>
-        </w:rPr>
-        <w:drawing>
-          <wp:inline distT="0" distB="0" distL="0" distR="0" wp14:anchorId="61DD5700" wp14:editId="73F94BAA">
-            <wp:extent cx="5943600" cy="3341370"/>
-            <wp:effectExtent l="0" t="0" r="0" b="0"/>
-            <wp:docPr id="10" name="Picture 10"/>
+            <wp:docPr id="5" name="Picture 5"/>
             <wp:cNvGraphicFramePr>
               <a:graphicFrameLocks xmlns:a="http://schemas.openxmlformats.org/drawingml/2006/main" noChangeAspect="1"/>
             </wp:cNvGraphicFramePr>
@@ -814,40 +471,355 @@
           <w:szCs w:val="26"/>
         </w:rPr>
       </w:pPr>
-    </w:p>
-    <w:p>
-      <w:pPr>
-        <w:rPr>
-          <w:rFonts w:ascii="Times New Roman" w:hAnsi="Times New Roman" w:cs="Times New Roman"/>
-          <w:sz w:val="26"/>
-          <w:szCs w:val="26"/>
-        </w:rPr>
-      </w:pPr>
-      <w:r>
-        <w:rPr>
-          <w:rFonts w:ascii="Times New Roman" w:hAnsi="Times New Roman" w:cs="Times New Roman"/>
-          <w:sz w:val="26"/>
-          <w:szCs w:val="26"/>
-        </w:rPr>
-        <w:t>B3: Sau khi sửa</w:t>
-      </w:r>
-      <w:r>
-        <w:rPr>
-          <w:rFonts w:ascii="Times New Roman" w:hAnsi="Times New Roman" w:cs="Times New Roman"/>
-          <w:sz w:val="26"/>
-          <w:szCs w:val="26"/>
-        </w:rPr>
-        <w:br/>
-      </w:r>
+      <w:r>
+        <w:rPr>
+          <w:rFonts w:ascii="Times New Roman" w:hAnsi="Times New Roman" w:cs="Times New Roman"/>
+          <w:sz w:val="26"/>
+          <w:szCs w:val="26"/>
+        </w:rPr>
+        <w:br w:type="page"/>
+      </w:r>
+    </w:p>
+    <w:p>
+      <w:pPr>
+        <w:rPr>
+          <w:rFonts w:ascii="Times New Roman" w:hAnsi="Times New Roman" w:cs="Times New Roman"/>
+          <w:sz w:val="26"/>
+          <w:szCs w:val="26"/>
+        </w:rPr>
+      </w:pPr>
+      <w:r>
+        <w:rPr>
+          <w:rFonts w:ascii="Times New Roman" w:hAnsi="Times New Roman" w:cs="Times New Roman"/>
+          <w:sz w:val="26"/>
+          <w:szCs w:val="26"/>
+        </w:rPr>
+        <w:lastRenderedPageBreak/>
+        <w:t>5.2. Read – Xem danh sách sản phẩm</w:t>
+      </w:r>
+    </w:p>
+    <w:p>
+      <w:pPr>
+        <w:rPr>
+          <w:rFonts w:ascii="Times New Roman" w:hAnsi="Times New Roman" w:cs="Times New Roman"/>
+          <w:sz w:val="26"/>
+          <w:szCs w:val="26"/>
+        </w:rPr>
+      </w:pPr>
+      <w:r>
+        <w:rPr>
+          <w:rFonts w:ascii="Times New Roman" w:hAnsi="Times New Roman" w:cs="Times New Roman"/>
+          <w:sz w:val="26"/>
+          <w:szCs w:val="26"/>
+        </w:rPr>
+        <w:t>•</w:t>
+      </w:r>
+      <w:r>
+        <w:rPr>
+          <w:rFonts w:ascii="Times New Roman" w:hAnsi="Times New Roman" w:cs="Times New Roman"/>
+          <w:sz w:val="26"/>
+          <w:szCs w:val="26"/>
+        </w:rPr>
+        <w:tab/>
+        <w:t>Hiển thị danh sách sản phẩm dưới dạng bảng</w:t>
+      </w:r>
+    </w:p>
+    <w:p>
+      <w:pPr>
+        <w:rPr>
+          <w:rFonts w:ascii="Times New Roman" w:hAnsi="Times New Roman" w:cs="Times New Roman"/>
+          <w:sz w:val="26"/>
+          <w:szCs w:val="26"/>
+        </w:rPr>
+      </w:pPr>
+      <w:r>
+        <w:rPr>
+          <w:rFonts w:ascii="Times New Roman" w:hAnsi="Times New Roman" w:cs="Times New Roman"/>
+          <w:sz w:val="26"/>
+          <w:szCs w:val="26"/>
+        </w:rPr>
+        <w:t>•</w:t>
+      </w:r>
+      <w:r>
+        <w:rPr>
+          <w:rFonts w:ascii="Times New Roman" w:hAnsi="Times New Roman" w:cs="Times New Roman"/>
+          <w:sz w:val="26"/>
+          <w:szCs w:val="26"/>
+        </w:rPr>
+        <w:tab/>
+        <w:t>Hiển thị hình ảnh, tên, giá, số lượng tồn kho</w:t>
+      </w:r>
+    </w:p>
+    <w:p>
+      <w:pPr>
+        <w:rPr>
+          <w:rFonts w:ascii="Times New Roman" w:hAnsi="Times New Roman" w:cs="Times New Roman"/>
+          <w:sz w:val="26"/>
+          <w:szCs w:val="26"/>
+        </w:rPr>
+      </w:pPr>
       <w:r>
         <w:rPr>
           <w:noProof/>
         </w:rPr>
         <w:drawing>
-          <wp:inline distT="0" distB="0" distL="0" distR="0" wp14:anchorId="6AC46AD3" wp14:editId="0968CC7F">
+          <wp:inline distT="0" distB="0" distL="0" distR="0" wp14:anchorId="54D7485E" wp14:editId="189491E6">
             <wp:extent cx="5943600" cy="3341370"/>
             <wp:effectExtent l="0" t="0" r="0" b="0"/>
-            <wp:docPr id="11" name="Picture 11"/>
+            <wp:docPr id="6" name="Picture 6"/>
+            <wp:cNvGraphicFramePr>
+              <a:graphicFrameLocks xmlns:a="http://schemas.openxmlformats.org/drawingml/2006/main" noChangeAspect="1"/>
+            </wp:cNvGraphicFramePr>
+            <a:graphic xmlns:a="http://schemas.openxmlformats.org/drawingml/2006/main">
+              <a:graphicData uri="http://schemas.openxmlformats.org/drawingml/2006/picture">
+                <pic:pic xmlns:pic="http://schemas.openxmlformats.org/drawingml/2006/picture">
+                  <pic:nvPicPr>
+                    <pic:cNvPr id="1" name=""/>
+                    <pic:cNvPicPr/>
+                  </pic:nvPicPr>
+                  <pic:blipFill>
+                    <a:blip r:embed="rId10"/>
+                    <a:stretch>
+                      <a:fillRect/>
+                    </a:stretch>
+                  </pic:blipFill>
+                  <pic:spPr>
+                    <a:xfrm>
+                      <a:off x="0" y="0"/>
+                      <a:ext cx="5943600" cy="3341370"/>
+                    </a:xfrm>
+                    <a:prstGeom prst="rect">
+                      <a:avLst/>
+                    </a:prstGeom>
+                  </pic:spPr>
+                </pic:pic>
+              </a:graphicData>
+            </a:graphic>
+          </wp:inline>
+        </w:drawing>
+      </w:r>
+    </w:p>
+    <w:p>
+      <w:pPr>
+        <w:rPr>
+          <w:rFonts w:ascii="Times New Roman" w:hAnsi="Times New Roman" w:cs="Times New Roman"/>
+          <w:sz w:val="26"/>
+          <w:szCs w:val="26"/>
+        </w:rPr>
+      </w:pPr>
+      <w:r>
+        <w:rPr>
+          <w:rFonts w:ascii="Times New Roman" w:hAnsi="Times New Roman" w:cs="Times New Roman"/>
+          <w:sz w:val="26"/>
+          <w:szCs w:val="26"/>
+        </w:rPr>
+        <w:br w:type="page"/>
+      </w:r>
+    </w:p>
+    <w:p>
+      <w:pPr>
+        <w:rPr>
+          <w:rFonts w:ascii="Times New Roman" w:hAnsi="Times New Roman" w:cs="Times New Roman"/>
+          <w:sz w:val="26"/>
+          <w:szCs w:val="26"/>
+        </w:rPr>
+      </w:pPr>
+      <w:r>
+        <w:rPr>
+          <w:rFonts w:ascii="Times New Roman" w:hAnsi="Times New Roman" w:cs="Times New Roman"/>
+          <w:sz w:val="26"/>
+          <w:szCs w:val="26"/>
+        </w:rPr>
+        <w:lastRenderedPageBreak/>
+        <w:t>5.3. Update – Cập nhật sản phẩm</w:t>
+      </w:r>
+    </w:p>
+    <w:p>
+      <w:pPr>
+        <w:rPr>
+          <w:rFonts w:ascii="Times New Roman" w:hAnsi="Times New Roman" w:cs="Times New Roman"/>
+          <w:sz w:val="26"/>
+          <w:szCs w:val="26"/>
+        </w:rPr>
+      </w:pPr>
+      <w:r>
+        <w:rPr>
+          <w:rFonts w:ascii="Times New Roman" w:hAnsi="Times New Roman" w:cs="Times New Roman"/>
+          <w:sz w:val="26"/>
+          <w:szCs w:val="26"/>
+        </w:rPr>
+        <w:t>•</w:t>
+      </w:r>
+      <w:r>
+        <w:rPr>
+          <w:rFonts w:ascii="Times New Roman" w:hAnsi="Times New Roman" w:cs="Times New Roman"/>
+          <w:sz w:val="26"/>
+          <w:szCs w:val="26"/>
+        </w:rPr>
+        <w:tab/>
+        <w:t>Chỉnh sửa tên, giá, số lượng, hình ảnh</w:t>
+      </w:r>
+    </w:p>
+    <w:p>
+      <w:pPr>
+        <w:rPr>
+          <w:rFonts w:ascii="Times New Roman" w:hAnsi="Times New Roman" w:cs="Times New Roman"/>
+          <w:sz w:val="26"/>
+          <w:szCs w:val="26"/>
+        </w:rPr>
+      </w:pPr>
+      <w:r>
+        <w:rPr>
+          <w:rFonts w:ascii="Times New Roman" w:hAnsi="Times New Roman" w:cs="Times New Roman"/>
+          <w:sz w:val="26"/>
+          <w:szCs w:val="26"/>
+        </w:rPr>
+        <w:t>•</w:t>
+      </w:r>
+      <w:r>
+        <w:rPr>
+          <w:rFonts w:ascii="Times New Roman" w:hAnsi="Times New Roman" w:cs="Times New Roman"/>
+          <w:sz w:val="26"/>
+          <w:szCs w:val="26"/>
+        </w:rPr>
+        <w:tab/>
+        <w:t>Cập nhật dữ liệu trong DynamoDB</w:t>
+      </w:r>
+    </w:p>
+    <w:p>
+      <w:pPr>
+        <w:rPr>
+          <w:rFonts w:ascii="Times New Roman" w:hAnsi="Times New Roman" w:cs="Times New Roman"/>
+          <w:sz w:val="26"/>
+          <w:szCs w:val="26"/>
+        </w:rPr>
+      </w:pPr>
+      <w:r>
+        <w:rPr>
+          <w:rFonts w:ascii="Times New Roman" w:hAnsi="Times New Roman" w:cs="Times New Roman"/>
+          <w:sz w:val="26"/>
+          <w:szCs w:val="26"/>
+        </w:rPr>
+        <w:t>B1: Trước khi sửa</w:t>
+      </w:r>
+    </w:p>
+    <w:p>
+      <w:pPr>
+        <w:rPr>
+          <w:rFonts w:ascii="Times New Roman" w:hAnsi="Times New Roman" w:cs="Times New Roman"/>
+          <w:sz w:val="26"/>
+          <w:szCs w:val="26"/>
+        </w:rPr>
+      </w:pPr>
+      <w:r>
+        <w:rPr>
+          <w:noProof/>
+        </w:rPr>
+        <w:drawing>
+          <wp:inline distT="0" distB="0" distL="0" distR="0" wp14:anchorId="05212DCA" wp14:editId="64E63FA6">
+            <wp:extent cx="5943600" cy="3341370"/>
+            <wp:effectExtent l="0" t="0" r="0" b="0"/>
+            <wp:docPr id="8" name="Picture 8"/>
+            <wp:cNvGraphicFramePr>
+              <a:graphicFrameLocks xmlns:a="http://schemas.openxmlformats.org/drawingml/2006/main" noChangeAspect="1"/>
+            </wp:cNvGraphicFramePr>
+            <a:graphic xmlns:a="http://schemas.openxmlformats.org/drawingml/2006/main">
+              <a:graphicData uri="http://schemas.openxmlformats.org/drawingml/2006/picture">
+                <pic:pic xmlns:pic="http://schemas.openxmlformats.org/drawingml/2006/picture">
+                  <pic:nvPicPr>
+                    <pic:cNvPr id="1" name=""/>
+                    <pic:cNvPicPr/>
+                  </pic:nvPicPr>
+                  <pic:blipFill>
+                    <a:blip r:embed="rId10"/>
+                    <a:stretch>
+                      <a:fillRect/>
+                    </a:stretch>
+                  </pic:blipFill>
+                  <pic:spPr>
+                    <a:xfrm>
+                      <a:off x="0" y="0"/>
+                      <a:ext cx="5943600" cy="3341370"/>
+                    </a:xfrm>
+                    <a:prstGeom prst="rect">
+                      <a:avLst/>
+                    </a:prstGeom>
+                  </pic:spPr>
+                </pic:pic>
+              </a:graphicData>
+            </a:graphic>
+          </wp:inline>
+        </w:drawing>
+      </w:r>
+    </w:p>
+    <w:p>
+      <w:pPr>
+        <w:rPr>
+          <w:rFonts w:ascii="Times New Roman" w:hAnsi="Times New Roman" w:cs="Times New Roman"/>
+          <w:sz w:val="26"/>
+          <w:szCs w:val="26"/>
+        </w:rPr>
+      </w:pPr>
+      <w:r>
+        <w:rPr>
+          <w:rFonts w:ascii="Times New Roman" w:hAnsi="Times New Roman" w:cs="Times New Roman"/>
+          <w:sz w:val="26"/>
+          <w:szCs w:val="26"/>
+        </w:rPr>
+        <w:br w:type="page"/>
+      </w:r>
+    </w:p>
+    <w:p>
+      <w:pPr>
+        <w:rPr>
+          <w:rFonts w:ascii="Times New Roman" w:hAnsi="Times New Roman" w:cs="Times New Roman"/>
+          <w:sz w:val="26"/>
+          <w:szCs w:val="26"/>
+        </w:rPr>
+      </w:pPr>
+      <w:r>
+        <w:rPr>
+          <w:rFonts w:ascii="Times New Roman" w:hAnsi="Times New Roman" w:cs="Times New Roman"/>
+          <w:sz w:val="26"/>
+          <w:szCs w:val="26"/>
+        </w:rPr>
+        <w:lastRenderedPageBreak/>
+        <w:t xml:space="preserve">B2: </w:t>
+      </w:r>
+      <w:r>
+        <w:rPr>
+          <w:rFonts w:ascii="Times New Roman" w:hAnsi="Times New Roman" w:cs="Times New Roman"/>
+          <w:sz w:val="26"/>
+          <w:szCs w:val="26"/>
+        </w:rPr>
+        <w:t>Chỉnh s</w:t>
+      </w:r>
+      <w:r>
+        <w:rPr>
+          <w:rFonts w:ascii="Times New Roman" w:hAnsi="Times New Roman" w:cs="Times New Roman"/>
+          <w:sz w:val="26"/>
+          <w:szCs w:val="26"/>
+        </w:rPr>
+        <w:t>ửa</w:t>
+      </w:r>
+    </w:p>
+    <w:p>
+      <w:pPr>
+        <w:rPr>
+          <w:rFonts w:ascii="Times New Roman" w:hAnsi="Times New Roman" w:cs="Times New Roman"/>
+          <w:sz w:val="26"/>
+          <w:szCs w:val="26"/>
+        </w:rPr>
+      </w:pPr>
+      <w:r>
+        <w:rPr>
+          <w:noProof/>
+        </w:rPr>
+        <w:drawing>
+          <wp:inline distT="0" distB="0" distL="0" distR="0" wp14:anchorId="61DD5700" wp14:editId="73F94BAA">
+            <wp:extent cx="5943600" cy="3341370"/>
+            <wp:effectExtent l="0" t="0" r="0" b="0"/>
+            <wp:docPr id="10" name="Picture 10"/>
             <wp:cNvGraphicFramePr>
               <a:graphicFrameLocks xmlns:a="http://schemas.openxmlformats.org/drawingml/2006/main" noChangeAspect="1"/>
             </wp:cNvGraphicFramePr>
@@ -888,211 +860,40 @@
           <w:szCs w:val="26"/>
         </w:rPr>
       </w:pPr>
-      <w:r>
-        <w:rPr>
-          <w:rFonts w:ascii="Times New Roman" w:hAnsi="Times New Roman" w:cs="Times New Roman"/>
-          <w:sz w:val="26"/>
-          <w:szCs w:val="26"/>
-        </w:rPr>
-        <w:br w:type="page"/>
-      </w:r>
-    </w:p>
-    <w:p>
-      <w:pPr>
-        <w:rPr>
-          <w:rFonts w:ascii="Times New Roman" w:hAnsi="Times New Roman" w:cs="Times New Roman"/>
-          <w:sz w:val="26"/>
-          <w:szCs w:val="26"/>
-        </w:rPr>
-      </w:pPr>
-      <w:r>
-        <w:rPr>
-          <w:rFonts w:ascii="Times New Roman" w:hAnsi="Times New Roman" w:cs="Times New Roman"/>
-          <w:sz w:val="26"/>
-          <w:szCs w:val="26"/>
-        </w:rPr>
-        <w:lastRenderedPageBreak/>
-        <w:t>5.4. Delete – Xoá sản phẩm</w:t>
-      </w:r>
-    </w:p>
-    <w:p>
-      <w:pPr>
-        <w:rPr>
-          <w:rFonts w:ascii="Times New Roman" w:hAnsi="Times New Roman" w:cs="Times New Roman"/>
-          <w:sz w:val="26"/>
-          <w:szCs w:val="26"/>
-        </w:rPr>
-      </w:pPr>
-      <w:r>
-        <w:rPr>
-          <w:rFonts w:ascii="Times New Roman" w:hAnsi="Times New Roman" w:cs="Times New Roman"/>
-          <w:sz w:val="26"/>
-          <w:szCs w:val="26"/>
-        </w:rPr>
-        <w:t>•</w:t>
-      </w:r>
-      <w:r>
-        <w:rPr>
-          <w:rFonts w:ascii="Times New Roman" w:hAnsi="Times New Roman" w:cs="Times New Roman"/>
-          <w:sz w:val="26"/>
-          <w:szCs w:val="26"/>
-        </w:rPr>
-        <w:tab/>
-        <w:t>Xoá sản phẩm theo id</w:t>
-      </w:r>
-    </w:p>
-    <w:p>
-      <w:pPr>
-        <w:rPr>
-          <w:rFonts w:ascii="Times New Roman" w:hAnsi="Times New Roman" w:cs="Times New Roman"/>
-          <w:sz w:val="26"/>
-          <w:szCs w:val="26"/>
-        </w:rPr>
-      </w:pPr>
-      <w:r>
-        <w:rPr>
-          <w:rFonts w:ascii="Times New Roman" w:hAnsi="Times New Roman" w:cs="Times New Roman"/>
-          <w:sz w:val="26"/>
-          <w:szCs w:val="26"/>
-        </w:rPr>
-        <w:t>•</w:t>
-      </w:r>
-      <w:r>
-        <w:rPr>
-          <w:rFonts w:ascii="Times New Roman" w:hAnsi="Times New Roman" w:cs="Times New Roman"/>
-          <w:sz w:val="26"/>
-          <w:szCs w:val="26"/>
-        </w:rPr>
-        <w:tab/>
-        <w:t>(Khuyến khích) Xoá cả hình ảnh liên quan trong S3</w:t>
-      </w:r>
-    </w:p>
-    <w:p>
-      <w:pPr>
-        <w:rPr>
-          <w:rFonts w:ascii="Times New Roman" w:hAnsi="Times New Roman" w:cs="Times New Roman"/>
-          <w:sz w:val="26"/>
-          <w:szCs w:val="26"/>
-        </w:rPr>
-      </w:pPr>
-      <w:r>
-        <w:rPr>
-          <w:rFonts w:ascii="Times New Roman" w:hAnsi="Times New Roman" w:cs="Times New Roman"/>
-          <w:sz w:val="26"/>
-          <w:szCs w:val="26"/>
-        </w:rPr>
-        <w:t>B1: Trước khi xóa</w:t>
-      </w:r>
-    </w:p>
-    <w:p>
-      <w:pPr>
-        <w:rPr>
-          <w:rFonts w:ascii="Times New Roman" w:hAnsi="Times New Roman" w:cs="Times New Roman"/>
-          <w:sz w:val="26"/>
-          <w:szCs w:val="26"/>
-        </w:rPr>
-      </w:pPr>
+    </w:p>
+    <w:p>
+      <w:pPr>
+        <w:rPr>
+          <w:rFonts w:ascii="Times New Roman" w:hAnsi="Times New Roman" w:cs="Times New Roman"/>
+          <w:sz w:val="26"/>
+          <w:szCs w:val="26"/>
+        </w:rPr>
+      </w:pPr>
+      <w:r>
+        <w:rPr>
+          <w:rFonts w:ascii="Times New Roman" w:hAnsi="Times New Roman" w:cs="Times New Roman"/>
+          <w:sz w:val="26"/>
+          <w:szCs w:val="26"/>
+        </w:rPr>
+        <w:t>B3: Sau khi sửa</w:t>
+      </w:r>
+      <w:r>
+        <w:rPr>
+          <w:rFonts w:ascii="Times New Roman" w:hAnsi="Times New Roman" w:cs="Times New Roman"/>
+          <w:sz w:val="26"/>
+          <w:szCs w:val="26"/>
+        </w:rPr>
+        <w:br/>
+      </w:r>
       <w:r>
         <w:rPr>
           <w:noProof/>
         </w:rPr>
         <w:drawing>
-          <wp:inline distT="0" distB="0" distL="0" distR="0" wp14:anchorId="2B0CC6F3" wp14:editId="67BCCC78">
+          <wp:inline distT="0" distB="0" distL="0" distR="0" wp14:anchorId="6AC46AD3" wp14:editId="0968CC7F">
             <wp:extent cx="5943600" cy="3341370"/>
             <wp:effectExtent l="0" t="0" r="0" b="0"/>
-            <wp:docPr id="12" name="Picture 12"/>
-            <wp:cNvGraphicFramePr>
-              <a:graphicFrameLocks xmlns:a="http://schemas.openxmlformats.org/drawingml/2006/main" noChangeAspect="1"/>
-            </wp:cNvGraphicFramePr>
-            <a:graphic xmlns:a="http://schemas.openxmlformats.org/drawingml/2006/main">
-              <a:graphicData uri="http://schemas.openxmlformats.org/drawingml/2006/picture">
-                <pic:pic xmlns:pic="http://schemas.openxmlformats.org/drawingml/2006/picture">
-                  <pic:nvPicPr>
-                    <pic:cNvPr id="1" name=""/>
-                    <pic:cNvPicPr/>
-                  </pic:nvPicPr>
-                  <pic:blipFill>
-                    <a:blip r:embed="rId11"/>
-                    <a:stretch>
-                      <a:fillRect/>
-                    </a:stretch>
-                  </pic:blipFill>
-                  <pic:spPr>
-                    <a:xfrm>
-                      <a:off x="0" y="0"/>
-                      <a:ext cx="5943600" cy="3341370"/>
-                    </a:xfrm>
-                    <a:prstGeom prst="rect">
-                      <a:avLst/>
-                    </a:prstGeom>
-                  </pic:spPr>
-                </pic:pic>
-              </a:graphicData>
-            </a:graphic>
-          </wp:inline>
-        </w:drawing>
-      </w:r>
-    </w:p>
-    <w:p>
-      <w:pPr>
-        <w:rPr>
-          <w:rFonts w:ascii="Times New Roman" w:hAnsi="Times New Roman" w:cs="Times New Roman"/>
-          <w:sz w:val="26"/>
-          <w:szCs w:val="26"/>
-        </w:rPr>
-      </w:pPr>
-      <w:r>
-        <w:rPr>
-          <w:rFonts w:ascii="Times New Roman" w:hAnsi="Times New Roman" w:cs="Times New Roman"/>
-          <w:sz w:val="26"/>
-          <w:szCs w:val="26"/>
-        </w:rPr>
-        <w:br w:type="page"/>
-      </w:r>
-    </w:p>
-    <w:p>
-      <w:pPr>
-        <w:rPr>
-          <w:rFonts w:ascii="Times New Roman" w:hAnsi="Times New Roman" w:cs="Times New Roman"/>
-          <w:sz w:val="26"/>
-          <w:szCs w:val="26"/>
-        </w:rPr>
-      </w:pPr>
-      <w:r>
-        <w:rPr>
-          <w:rFonts w:ascii="Times New Roman" w:hAnsi="Times New Roman" w:cs="Times New Roman"/>
-          <w:sz w:val="26"/>
-          <w:szCs w:val="26"/>
-        </w:rPr>
-        <w:lastRenderedPageBreak/>
-        <w:t>B2: X</w:t>
-      </w:r>
-      <w:r>
-        <w:rPr>
-          <w:rFonts w:ascii="Times New Roman" w:hAnsi="Times New Roman" w:cs="Times New Roman"/>
-          <w:sz w:val="26"/>
-          <w:szCs w:val="26"/>
-        </w:rPr>
-        <w:t>óa</w:t>
-      </w:r>
-    </w:p>
-    <w:p>
-      <w:pPr>
-        <w:rPr>
-          <w:rFonts w:ascii="Times New Roman" w:hAnsi="Times New Roman" w:cs="Times New Roman"/>
-          <w:sz w:val="26"/>
-          <w:szCs w:val="26"/>
-        </w:rPr>
-      </w:pPr>
-      <w:r>
-        <w:rPr>
-          <w:noProof/>
-        </w:rPr>
-        <w:drawing>
-          <wp:inline distT="0" distB="0" distL="0" distR="0" wp14:anchorId="52DA7CA6" wp14:editId="35EF961F">
-            <wp:extent cx="5943600" cy="3341370"/>
-            <wp:effectExtent l="0" t="0" r="0" b="0"/>
-            <wp:docPr id="13" name="Picture 13"/>
+            <wp:docPr id="11" name="Picture 11"/>
             <wp:cNvGraphicFramePr>
               <a:graphicFrameLocks xmlns:a="http://schemas.openxmlformats.org/drawingml/2006/main" noChangeAspect="1"/>
             </wp:cNvGraphicFramePr>
@@ -1133,22 +934,100 @@
           <w:szCs w:val="26"/>
         </w:rPr>
       </w:pPr>
-    </w:p>
-    <w:p>
-      <w:pPr>
-        <w:rPr>
-          <w:rFonts w:ascii="Times New Roman" w:hAnsi="Times New Roman" w:cs="Times New Roman"/>
-          <w:sz w:val="26"/>
-          <w:szCs w:val="26"/>
-        </w:rPr>
-      </w:pPr>
-      <w:r>
-        <w:rPr>
-          <w:rFonts w:ascii="Times New Roman" w:hAnsi="Times New Roman" w:cs="Times New Roman"/>
-          <w:sz w:val="26"/>
-          <w:szCs w:val="26"/>
-        </w:rPr>
-        <w:t>B3: Sau khi xóa</w:t>
+      <w:r>
+        <w:rPr>
+          <w:rFonts w:ascii="Times New Roman" w:hAnsi="Times New Roman" w:cs="Times New Roman"/>
+          <w:sz w:val="26"/>
+          <w:szCs w:val="26"/>
+        </w:rPr>
+        <w:br w:type="page"/>
+      </w:r>
+    </w:p>
+    <w:p>
+      <w:pPr>
+        <w:rPr>
+          <w:rFonts w:ascii="Times New Roman" w:hAnsi="Times New Roman" w:cs="Times New Roman"/>
+          <w:sz w:val="26"/>
+          <w:szCs w:val="26"/>
+        </w:rPr>
+      </w:pPr>
+      <w:r>
+        <w:rPr>
+          <w:rFonts w:ascii="Times New Roman" w:hAnsi="Times New Roman" w:cs="Times New Roman"/>
+          <w:sz w:val="26"/>
+          <w:szCs w:val="26"/>
+        </w:rPr>
+        <w:lastRenderedPageBreak/>
+        <w:t>5.4. Delete – Xoá sản phẩm</w:t>
+      </w:r>
+    </w:p>
+    <w:p>
+      <w:pPr>
+        <w:rPr>
+          <w:rFonts w:ascii="Times New Roman" w:hAnsi="Times New Roman" w:cs="Times New Roman"/>
+          <w:sz w:val="26"/>
+          <w:szCs w:val="26"/>
+        </w:rPr>
+      </w:pPr>
+      <w:r>
+        <w:rPr>
+          <w:rFonts w:ascii="Times New Roman" w:hAnsi="Times New Roman" w:cs="Times New Roman"/>
+          <w:sz w:val="26"/>
+          <w:szCs w:val="26"/>
+        </w:rPr>
+        <w:t>•</w:t>
+      </w:r>
+      <w:r>
+        <w:rPr>
+          <w:rFonts w:ascii="Times New Roman" w:hAnsi="Times New Roman" w:cs="Times New Roman"/>
+          <w:sz w:val="26"/>
+          <w:szCs w:val="26"/>
+        </w:rPr>
+        <w:tab/>
+        <w:t>Xoá sản phẩm theo id</w:t>
+      </w:r>
+    </w:p>
+    <w:p>
+      <w:pPr>
+        <w:rPr>
+          <w:rFonts w:ascii="Times New Roman" w:hAnsi="Times New Roman" w:cs="Times New Roman"/>
+          <w:sz w:val="26"/>
+          <w:szCs w:val="26"/>
+        </w:rPr>
+      </w:pPr>
+      <w:r>
+        <w:rPr>
+          <w:rFonts w:ascii="Times New Roman" w:hAnsi="Times New Roman" w:cs="Times New Roman"/>
+          <w:sz w:val="26"/>
+          <w:szCs w:val="26"/>
+        </w:rPr>
+        <w:t>•</w:t>
+      </w:r>
+      <w:r>
+        <w:rPr>
+          <w:rFonts w:ascii="Times New Roman" w:hAnsi="Times New Roman" w:cs="Times New Roman"/>
+          <w:sz w:val="26"/>
+          <w:szCs w:val="26"/>
+        </w:rPr>
+        <w:tab/>
+        <w:t>(Khuyến khích) Xoá cả hình ảnh liên quan trong S3</w:t>
+      </w:r>
+    </w:p>
+    <w:p>
+      <w:pPr>
+        <w:rPr>
+          <w:rFonts w:ascii="Times New Roman" w:hAnsi="Times New Roman" w:cs="Times New Roman"/>
+          <w:sz w:val="26"/>
+          <w:szCs w:val="26"/>
+        </w:rPr>
+      </w:pPr>
+      <w:r>
+        <w:rPr>
+          <w:rFonts w:ascii="Times New Roman" w:hAnsi="Times New Roman" w:cs="Times New Roman"/>
+          <w:sz w:val="26"/>
+          <w:szCs w:val="26"/>
+        </w:rPr>
+        <w:t>B1: Trước khi xóa</w:t>
       </w:r>
     </w:p>
     <w:p>
@@ -1164,10 +1043,102 @@
           <w:noProof/>
         </w:rPr>
         <w:drawing>
-          <wp:inline distT="0" distB="0" distL="0" distR="0" wp14:anchorId="2A5D28FE" wp14:editId="5480388C">
+          <wp:inline distT="0" distB="0" distL="0" distR="0" wp14:anchorId="2B0CC6F3" wp14:editId="67BCCC78">
             <wp:extent cx="5943600" cy="3341370"/>
             <wp:effectExtent l="0" t="0" r="0" b="0"/>
-            <wp:docPr id="14" name="Picture 14"/>
+            <wp:docPr id="12" name="Picture 12"/>
+            <wp:cNvGraphicFramePr>
+              <a:graphicFrameLocks xmlns:a="http://schemas.openxmlformats.org/drawingml/2006/main" noChangeAspect="1"/>
+            </wp:cNvGraphicFramePr>
+            <a:graphic xmlns:a="http://schemas.openxmlformats.org/drawingml/2006/main">
+              <a:graphicData uri="http://schemas.openxmlformats.org/drawingml/2006/picture">
+                <pic:pic xmlns:pic="http://schemas.openxmlformats.org/drawingml/2006/picture">
+                  <pic:nvPicPr>
+                    <pic:cNvPr id="1" name=""/>
+                    <pic:cNvPicPr/>
+                  </pic:nvPicPr>
+                  <pic:blipFill>
+                    <a:blip r:embed="rId12"/>
+                    <a:stretch>
+                      <a:fillRect/>
+                    </a:stretch>
+                  </pic:blipFill>
+                  <pic:spPr>
+                    <a:xfrm>
+                      <a:off x="0" y="0"/>
+                      <a:ext cx="5943600" cy="3341370"/>
+                    </a:xfrm>
+                    <a:prstGeom prst="rect">
+                      <a:avLst/>
+                    </a:prstGeom>
+                  </pic:spPr>
+                </pic:pic>
+              </a:graphicData>
+            </a:graphic>
+          </wp:inline>
+        </w:drawing>
+      </w:r>
+    </w:p>
+    <w:p>
+      <w:pPr>
+        <w:rPr>
+          <w:rFonts w:ascii="Times New Roman" w:hAnsi="Times New Roman" w:cs="Times New Roman"/>
+          <w:sz w:val="26"/>
+          <w:szCs w:val="26"/>
+        </w:rPr>
+      </w:pPr>
+      <w:r>
+        <w:rPr>
+          <w:rFonts w:ascii="Times New Roman" w:hAnsi="Times New Roman" w:cs="Times New Roman"/>
+          <w:sz w:val="26"/>
+          <w:szCs w:val="26"/>
+        </w:rPr>
+        <w:br w:type="page"/>
+      </w:r>
+    </w:p>
+    <w:p>
+      <w:pPr>
+        <w:rPr>
+          <w:rFonts w:ascii="Times New Roman" w:hAnsi="Times New Roman" w:cs="Times New Roman"/>
+          <w:sz w:val="26"/>
+          <w:szCs w:val="26"/>
+        </w:rPr>
+      </w:pPr>
+      <w:r>
+        <w:rPr>
+          <w:rFonts w:ascii="Times New Roman" w:hAnsi="Times New Roman" w:cs="Times New Roman"/>
+          <w:sz w:val="26"/>
+          <w:szCs w:val="26"/>
+        </w:rPr>
+        <w:lastRenderedPageBreak/>
+        <w:t>B2: X</w:t>
+      </w:r>
+      <w:r>
+        <w:rPr>
+          <w:rFonts w:ascii="Times New Roman" w:hAnsi="Times New Roman" w:cs="Times New Roman"/>
+          <w:sz w:val="26"/>
+          <w:szCs w:val="26"/>
+        </w:rPr>
+        <w:t>óa</w:t>
+      </w:r>
+    </w:p>
+    <w:p>
+      <w:pPr>
+        <w:rPr>
+          <w:rFonts w:ascii="Times New Roman" w:hAnsi="Times New Roman" w:cs="Times New Roman"/>
+          <w:sz w:val="26"/>
+          <w:szCs w:val="26"/>
+        </w:rPr>
+      </w:pPr>
+      <w:r>
+        <w:rPr>
+          <w:noProof/>
+        </w:rPr>
+        <w:drawing>
+          <wp:inline distT="0" distB="0" distL="0" distR="0" wp14:anchorId="52DA7CA6" wp14:editId="35EF961F">
+            <wp:extent cx="5943600" cy="3341370"/>
+            <wp:effectExtent l="0" t="0" r="0" b="0"/>
+            <wp:docPr id="13" name="Picture 13"/>
             <wp:cNvGraphicFramePr>
               <a:graphicFrameLocks xmlns:a="http://schemas.openxmlformats.org/drawingml/2006/main" noChangeAspect="1"/>
             </wp:cNvGraphicFramePr>
@@ -1223,35 +1194,7 @@
           <w:sz w:val="26"/>
           <w:szCs w:val="26"/>
         </w:rPr>
-        <w:lastRenderedPageBreak/>
-        <w:t>6. Yêu cầu giao diện</w:t>
-      </w:r>
-    </w:p>
-    <w:p>
-      <w:pPr>
-        <w:ind w:left="720"/>
-        <w:rPr>
-          <w:rFonts w:ascii="Times New Roman" w:hAnsi="Times New Roman" w:cs="Times New Roman"/>
-          <w:sz w:val="26"/>
-          <w:szCs w:val="26"/>
-        </w:rPr>
-      </w:pPr>
-      <w:r>
-        <w:rPr>
-          <w:rFonts w:ascii="Times New Roman" w:hAnsi="Times New Roman" w:cs="Times New Roman"/>
-          <w:sz w:val="26"/>
-          <w:szCs w:val="26"/>
-        </w:rPr>
-        <w:t>•</w:t>
-      </w:r>
-      <w:r>
-        <w:rPr>
-          <w:rFonts w:ascii="Times New Roman" w:hAnsi="Times New Roman" w:cs="Times New Roman"/>
-          <w:sz w:val="26"/>
-          <w:szCs w:val="26"/>
-        </w:rPr>
-        <w:tab/>
-        <w:t>Sử dụng EJS để render giao diện</w:t>
+        <w:t>B3: Sau khi xóa</w:t>
       </w:r>
     </w:p>
     <w:p>
@@ -1267,10 +1210,10 @@
           <w:noProof/>
         </w:rPr>
         <w:drawing>
-          <wp:inline distT="0" distB="0" distL="0" distR="0" wp14:anchorId="0B5911DF" wp14:editId="65E3D77E">
+          <wp:inline distT="0" distB="0" distL="0" distR="0" wp14:anchorId="2A5D28FE" wp14:editId="5480388C">
             <wp:extent cx="5943600" cy="3341370"/>
             <wp:effectExtent l="0" t="0" r="0" b="0"/>
-            <wp:docPr id="16" name="Picture 16"/>
+            <wp:docPr id="14" name="Picture 14"/>
             <wp:cNvGraphicFramePr>
               <a:graphicFrameLocks xmlns:a="http://schemas.openxmlformats.org/drawingml/2006/main" noChangeAspect="1"/>
             </wp:cNvGraphicFramePr>
@@ -1305,6 +1248,33 @@
     </w:p>
     <w:p>
       <w:pPr>
+        <w:rPr>
+          <w:rFonts w:ascii="Times New Roman" w:hAnsi="Times New Roman" w:cs="Times New Roman"/>
+          <w:sz w:val="26"/>
+          <w:szCs w:val="26"/>
+        </w:rPr>
+      </w:pPr>
+    </w:p>
+    <w:p>
+      <w:pPr>
+        <w:rPr>
+          <w:rFonts w:ascii="Times New Roman" w:hAnsi="Times New Roman" w:cs="Times New Roman"/>
+          <w:sz w:val="26"/>
+          <w:szCs w:val="26"/>
+        </w:rPr>
+      </w:pPr>
+      <w:r>
+        <w:rPr>
+          <w:rFonts w:ascii="Times New Roman" w:hAnsi="Times New Roman" w:cs="Times New Roman"/>
+          <w:sz w:val="26"/>
+          <w:szCs w:val="26"/>
+        </w:rPr>
+        <w:lastRenderedPageBreak/>
+        <w:t>6. Yêu cầu giao diện</w:t>
+      </w:r>
+    </w:p>
+    <w:p>
+      <w:pPr>
         <w:ind w:left="720"/>
         <w:rPr>
           <w:rFonts w:ascii="Times New Roman" w:hAnsi="Times New Roman" w:cs="Times New Roman"/>
@@ -1327,34 +1297,7 @@
           <w:szCs w:val="26"/>
         </w:rPr>
         <w:tab/>
-        <w:t>Có các trang:</w:t>
-      </w:r>
-    </w:p>
-    <w:p>
-      <w:pPr>
-        <w:ind w:left="1440"/>
-        <w:rPr>
-          <w:rFonts w:ascii="Times New Roman" w:hAnsi="Times New Roman" w:cs="Times New Roman"/>
-          <w:sz w:val="26"/>
-          <w:szCs w:val="26"/>
-        </w:rPr>
-      </w:pPr>
-      <w:r>
-        <w:rPr>
-          <w:rFonts w:ascii="Times New Roman" w:hAnsi="Times New Roman" w:cs="Times New Roman"/>
-          <w:sz w:val="26"/>
-          <w:szCs w:val="26"/>
-        </w:rPr>
-        <w:t>o</w:t>
-      </w:r>
-      <w:r>
-        <w:rPr>
-          <w:rFonts w:ascii="Times New Roman" w:hAnsi="Times New Roman" w:cs="Times New Roman"/>
-          <w:sz w:val="26"/>
-          <w:szCs w:val="26"/>
-        </w:rPr>
-        <w:tab/>
-        <w:t>Trang danh sách sản phẩm</w:t>
+        <w:t>Sử dụng EJS để render giao diện</w:t>
       </w:r>
     </w:p>
     <w:p>
@@ -1370,87 +1313,10 @@
           <w:noProof/>
         </w:rPr>
         <w:drawing>
-          <wp:inline distT="0" distB="0" distL="0" distR="0" wp14:anchorId="0CE53A5D" wp14:editId="21F90C36">
+          <wp:inline distT="0" distB="0" distL="0" distR="0" wp14:anchorId="0B5911DF" wp14:editId="65E3D77E">
             <wp:extent cx="5943600" cy="3341370"/>
             <wp:effectExtent l="0" t="0" r="0" b="0"/>
-            <wp:docPr id="17" name="Picture 17"/>
-            <wp:cNvGraphicFramePr>
-              <a:graphicFrameLocks xmlns:a="http://schemas.openxmlformats.org/drawingml/2006/main" noChangeAspect="1"/>
-            </wp:cNvGraphicFramePr>
-            <a:graphic xmlns:a="http://schemas.openxmlformats.org/drawingml/2006/main">
-              <a:graphicData uri="http://schemas.openxmlformats.org/drawingml/2006/picture">
-                <pic:pic xmlns:pic="http://schemas.openxmlformats.org/drawingml/2006/picture">
-                  <pic:nvPicPr>
-                    <pic:cNvPr id="1" name=""/>
-                    <pic:cNvPicPr/>
-                  </pic:nvPicPr>
-                  <pic:blipFill>
-                    <a:blip r:embed="rId14"/>
-                    <a:stretch>
-                      <a:fillRect/>
-                    </a:stretch>
-                  </pic:blipFill>
-                  <pic:spPr>
-                    <a:xfrm>
-                      <a:off x="0" y="0"/>
-                      <a:ext cx="5943600" cy="3341370"/>
-                    </a:xfrm>
-                    <a:prstGeom prst="rect">
-                      <a:avLst/>
-                    </a:prstGeom>
-                  </pic:spPr>
-                </pic:pic>
-              </a:graphicData>
-            </a:graphic>
-          </wp:inline>
-        </w:drawing>
-      </w:r>
-    </w:p>
-    <w:p>
-      <w:pPr>
-        <w:ind w:left="1440"/>
-        <w:rPr>
-          <w:rFonts w:ascii="Times New Roman" w:hAnsi="Times New Roman" w:cs="Times New Roman"/>
-          <w:sz w:val="26"/>
-          <w:szCs w:val="26"/>
-        </w:rPr>
-      </w:pPr>
-      <w:r>
-        <w:rPr>
-          <w:rFonts w:ascii="Times New Roman" w:hAnsi="Times New Roman" w:cs="Times New Roman"/>
-          <w:sz w:val="26"/>
-          <w:szCs w:val="26"/>
-        </w:rPr>
-        <w:lastRenderedPageBreak/>
-        <w:t>o</w:t>
-      </w:r>
-      <w:r>
-        <w:rPr>
-          <w:rFonts w:ascii="Times New Roman" w:hAnsi="Times New Roman" w:cs="Times New Roman"/>
-          <w:sz w:val="26"/>
-          <w:szCs w:val="26"/>
-        </w:rPr>
-        <w:tab/>
-        <w:t>Trang thêm sản phẩm</w:t>
-      </w:r>
-    </w:p>
-    <w:p>
-      <w:pPr>
-        <w:rPr>
-          <w:rFonts w:ascii="Times New Roman" w:hAnsi="Times New Roman" w:cs="Times New Roman"/>
-          <w:sz w:val="26"/>
-          <w:szCs w:val="26"/>
-        </w:rPr>
-      </w:pPr>
-      <w:r>
-        <w:rPr>
-          <w:noProof/>
-        </w:rPr>
-        <w:drawing>
-          <wp:inline distT="0" distB="0" distL="0" distR="0" wp14:anchorId="4894C7AC" wp14:editId="1B6E284D">
-            <wp:extent cx="5943600" cy="3341370"/>
-            <wp:effectExtent l="0" t="0" r="0" b="0"/>
-            <wp:docPr id="18" name="Picture 18"/>
+            <wp:docPr id="16" name="Picture 16"/>
             <wp:cNvGraphicFramePr>
               <a:graphicFrameLocks xmlns:a="http://schemas.openxmlformats.org/drawingml/2006/main" noChangeAspect="1"/>
             </wp:cNvGraphicFramePr>
@@ -1485,12 +1351,30 @@
     </w:p>
     <w:p>
       <w:pPr>
-        <w:rPr>
-          <w:rFonts w:ascii="Times New Roman" w:hAnsi="Times New Roman" w:cs="Times New Roman"/>
-          <w:sz w:val="26"/>
-          <w:szCs w:val="26"/>
-        </w:rPr>
-      </w:pPr>
+        <w:ind w:left="720"/>
+        <w:rPr>
+          <w:rFonts w:ascii="Times New Roman" w:hAnsi="Times New Roman" w:cs="Times New Roman"/>
+          <w:sz w:val="26"/>
+          <w:szCs w:val="26"/>
+        </w:rPr>
+      </w:pPr>
+      <w:r>
+        <w:rPr>
+          <w:rFonts w:ascii="Times New Roman" w:hAnsi="Times New Roman" w:cs="Times New Roman"/>
+          <w:sz w:val="26"/>
+          <w:szCs w:val="26"/>
+        </w:rPr>
+        <w:t>•</w:t>
+      </w:r>
+      <w:r>
+        <w:rPr>
+          <w:rFonts w:ascii="Times New Roman" w:hAnsi="Times New Roman" w:cs="Times New Roman"/>
+          <w:sz w:val="26"/>
+          <w:szCs w:val="26"/>
+        </w:rPr>
+        <w:tab/>
+        <w:t>Có các trang:</w:t>
+      </w:r>
     </w:p>
     <w:p>
       <w:pPr>
@@ -1516,7 +1400,7 @@
           <w:szCs w:val="26"/>
         </w:rPr>
         <w:tab/>
-        <w:t>Trang chỉnh sửa sản phẩm</w:t>
+        <w:t>Trang danh sách sản phẩm</w:t>
       </w:r>
     </w:p>
     <w:p>
@@ -1532,10 +1416,87 @@
           <w:noProof/>
         </w:rPr>
         <w:drawing>
-          <wp:inline distT="0" distB="0" distL="0" distR="0" wp14:anchorId="5579EC0B" wp14:editId="115A4F25">
+          <wp:inline distT="0" distB="0" distL="0" distR="0" wp14:anchorId="0CE53A5D" wp14:editId="21F90C36">
             <wp:extent cx="5943600" cy="3341370"/>
             <wp:effectExtent l="0" t="0" r="0" b="0"/>
-            <wp:docPr id="19" name="Picture 19"/>
+            <wp:docPr id="17" name="Picture 17"/>
+            <wp:cNvGraphicFramePr>
+              <a:graphicFrameLocks xmlns:a="http://schemas.openxmlformats.org/drawingml/2006/main" noChangeAspect="1"/>
+            </wp:cNvGraphicFramePr>
+            <a:graphic xmlns:a="http://schemas.openxmlformats.org/drawingml/2006/main">
+              <a:graphicData uri="http://schemas.openxmlformats.org/drawingml/2006/picture">
+                <pic:pic xmlns:pic="http://schemas.openxmlformats.org/drawingml/2006/picture">
+                  <pic:nvPicPr>
+                    <pic:cNvPr id="1" name=""/>
+                    <pic:cNvPicPr/>
+                  </pic:nvPicPr>
+                  <pic:blipFill>
+                    <a:blip r:embed="rId15"/>
+                    <a:stretch>
+                      <a:fillRect/>
+                    </a:stretch>
+                  </pic:blipFill>
+                  <pic:spPr>
+                    <a:xfrm>
+                      <a:off x="0" y="0"/>
+                      <a:ext cx="5943600" cy="3341370"/>
+                    </a:xfrm>
+                    <a:prstGeom prst="rect">
+                      <a:avLst/>
+                    </a:prstGeom>
+                  </pic:spPr>
+                </pic:pic>
+              </a:graphicData>
+            </a:graphic>
+          </wp:inline>
+        </w:drawing>
+      </w:r>
+    </w:p>
+    <w:p>
+      <w:pPr>
+        <w:ind w:left="1440"/>
+        <w:rPr>
+          <w:rFonts w:ascii="Times New Roman" w:hAnsi="Times New Roman" w:cs="Times New Roman"/>
+          <w:sz w:val="26"/>
+          <w:szCs w:val="26"/>
+        </w:rPr>
+      </w:pPr>
+      <w:r>
+        <w:rPr>
+          <w:rFonts w:ascii="Times New Roman" w:hAnsi="Times New Roman" w:cs="Times New Roman"/>
+          <w:sz w:val="26"/>
+          <w:szCs w:val="26"/>
+        </w:rPr>
+        <w:lastRenderedPageBreak/>
+        <w:t>o</w:t>
+      </w:r>
+      <w:r>
+        <w:rPr>
+          <w:rFonts w:ascii="Times New Roman" w:hAnsi="Times New Roman" w:cs="Times New Roman"/>
+          <w:sz w:val="26"/>
+          <w:szCs w:val="26"/>
+        </w:rPr>
+        <w:tab/>
+        <w:t>Trang thêm sản phẩm</w:t>
+      </w:r>
+    </w:p>
+    <w:p>
+      <w:pPr>
+        <w:rPr>
+          <w:rFonts w:ascii="Times New Roman" w:hAnsi="Times New Roman" w:cs="Times New Roman"/>
+          <w:sz w:val="26"/>
+          <w:szCs w:val="26"/>
+        </w:rPr>
+      </w:pPr>
+      <w:r>
+        <w:rPr>
+          <w:noProof/>
+        </w:rPr>
+        <w:drawing>
+          <wp:inline distT="0" distB="0" distL="0" distR="0" wp14:anchorId="4894C7AC" wp14:editId="1B6E284D">
+            <wp:extent cx="5943600" cy="3341370"/>
+            <wp:effectExtent l="0" t="0" r="0" b="0"/>
+            <wp:docPr id="18" name="Picture 18"/>
             <wp:cNvGraphicFramePr>
               <a:graphicFrameLocks xmlns:a="http://schemas.openxmlformats.org/drawingml/2006/main" noChangeAspect="1"/>
             </wp:cNvGraphicFramePr>
@@ -1579,21 +1540,20 @@
     </w:p>
     <w:p>
       <w:pPr>
-        <w:ind w:left="720"/>
-        <w:rPr>
-          <w:rFonts w:ascii="Times New Roman" w:hAnsi="Times New Roman" w:cs="Times New Roman"/>
-          <w:sz w:val="26"/>
-          <w:szCs w:val="26"/>
-        </w:rPr>
-      </w:pPr>
-      <w:r>
-        <w:rPr>
-          <w:rFonts w:ascii="Times New Roman" w:hAnsi="Times New Roman" w:cs="Times New Roman"/>
-          <w:sz w:val="26"/>
-          <w:szCs w:val="26"/>
-        </w:rPr>
-        <w:lastRenderedPageBreak/>
-        <w:t>•</w:t>
+        <w:ind w:left="1440"/>
+        <w:rPr>
+          <w:rFonts w:ascii="Times New Roman" w:hAnsi="Times New Roman" w:cs="Times New Roman"/>
+          <w:sz w:val="26"/>
+          <w:szCs w:val="26"/>
+        </w:rPr>
+      </w:pPr>
+      <w:r>
+        <w:rPr>
+          <w:rFonts w:ascii="Times New Roman" w:hAnsi="Times New Roman" w:cs="Times New Roman"/>
+          <w:sz w:val="26"/>
+          <w:szCs w:val="26"/>
+        </w:rPr>
+        <w:t>o</w:t>
       </w:r>
       <w:r>
         <w:rPr>
@@ -1602,7 +1562,7 @@
           <w:szCs w:val="26"/>
         </w:rPr>
         <w:tab/>
-        <w:t>Giao diện đơn giản, dễ sử dụng</w:t>
+        <w:t>Trang chỉnh sửa sản phẩm</w:t>
       </w:r>
     </w:p>
     <w:p>
@@ -1618,10 +1578,10 @@
           <w:noProof/>
         </w:rPr>
         <w:drawing>
-          <wp:inline distT="0" distB="0" distL="0" distR="0" wp14:anchorId="55840AD7" wp14:editId="5CA845B8">
+          <wp:inline distT="0" distB="0" distL="0" distR="0" wp14:anchorId="5579EC0B" wp14:editId="115A4F25">
             <wp:extent cx="5943600" cy="3341370"/>
             <wp:effectExtent l="0" t="0" r="0" b="0"/>
-            <wp:docPr id="20" name="Picture 20"/>
+            <wp:docPr id="19" name="Picture 19"/>
             <wp:cNvGraphicFramePr>
               <a:graphicFrameLocks xmlns:a="http://schemas.openxmlformats.org/drawingml/2006/main" noChangeAspect="1"/>
             </wp:cNvGraphicFramePr>
@@ -1662,17 +1622,10 @@
           <w:szCs w:val="26"/>
         </w:rPr>
       </w:pPr>
-      <w:r>
-        <w:rPr>
-          <w:rFonts w:ascii="Times New Roman" w:hAnsi="Times New Roman" w:cs="Times New Roman"/>
-          <w:sz w:val="26"/>
-          <w:szCs w:val="26"/>
-        </w:rPr>
-        <w:br w:type="page"/>
-      </w:r>
-    </w:p>
-    <w:p>
-      <w:pPr>
+    </w:p>
+    <w:p>
+      <w:pPr>
+        <w:ind w:left="720"/>
         <w:rPr>
           <w:rFonts w:ascii="Times New Roman" w:hAnsi="Times New Roman" w:cs="Times New Roman"/>
           <w:sz w:val="26"/>
@@ -1686,12 +1639,20 @@
           <w:szCs w:val="26"/>
         </w:rPr>
         <w:lastRenderedPageBreak/>
-        <w:t>Cấu trúc thư mục</w:t>
-      </w:r>
-    </w:p>
-    <w:p>
-      <w:pPr>
-        <w:jc w:val="center"/>
+        <w:t>•</w:t>
+      </w:r>
+      <w:r>
+        <w:rPr>
+          <w:rFonts w:ascii="Times New Roman" w:hAnsi="Times New Roman" w:cs="Times New Roman"/>
+          <w:sz w:val="26"/>
+          <w:szCs w:val="26"/>
+        </w:rPr>
+        <w:tab/>
+        <w:t>Giao diện đơn giản, dễ sử dụng</w:t>
+      </w:r>
+    </w:p>
+    <w:p>
+      <w:pPr>
         <w:rPr>
           <w:rFonts w:ascii="Times New Roman" w:hAnsi="Times New Roman" w:cs="Times New Roman"/>
           <w:sz w:val="26"/>
@@ -1703,10 +1664,10 @@
           <w:noProof/>
         </w:rPr>
         <w:drawing>
-          <wp:inline distT="0" distB="0" distL="0" distR="0" wp14:anchorId="60B37DEB" wp14:editId="0580835B">
-            <wp:extent cx="2486025" cy="5419725"/>
-            <wp:effectExtent l="0" t="0" r="9525" b="9525"/>
-            <wp:docPr id="15" name="Picture 15"/>
+          <wp:inline distT="0" distB="0" distL="0" distR="0" wp14:anchorId="55840AD7" wp14:editId="5CA845B8">
+            <wp:extent cx="5943600" cy="3341370"/>
+            <wp:effectExtent l="0" t="0" r="0" b="0"/>
+            <wp:docPr id="20" name="Picture 20"/>
             <wp:cNvGraphicFramePr>
               <a:graphicFrameLocks xmlns:a="http://schemas.openxmlformats.org/drawingml/2006/main" noChangeAspect="1"/>
             </wp:cNvGraphicFramePr>
@@ -1726,7 +1687,7 @@
                   <pic:spPr>
                     <a:xfrm>
                       <a:off x="0" y="0"/>
-                      <a:ext cx="2486025" cy="5419725"/>
+                      <a:ext cx="5943600" cy="3341370"/>
                     </a:xfrm>
                     <a:prstGeom prst="rect">
                       <a:avLst/>
@@ -1771,11 +1732,12 @@
           <w:szCs w:val="26"/>
         </w:rPr>
         <w:lastRenderedPageBreak/>
-        <w:t>Bổ sung:</w:t>
-      </w:r>
-    </w:p>
-    <w:p>
-      <w:pPr>
+        <w:t>Cấu trúc thư mục</w:t>
+      </w:r>
+    </w:p>
+    <w:p>
+      <w:pPr>
+        <w:jc w:val="center"/>
         <w:rPr>
           <w:rFonts w:ascii="Times New Roman" w:hAnsi="Times New Roman" w:cs="Times New Roman"/>
           <w:sz w:val="26"/>
@@ -1787,10 +1749,10 @@
           <w:noProof/>
         </w:rPr>
         <w:drawing>
-          <wp:inline distT="0" distB="0" distL="0" distR="0" wp14:anchorId="4E387D43" wp14:editId="3DDCED8E">
-            <wp:extent cx="5943600" cy="3077845"/>
-            <wp:effectExtent l="0" t="0" r="0" b="8255"/>
-            <wp:docPr id="21" name="Picture 21"/>
+          <wp:inline distT="0" distB="0" distL="0" distR="0" wp14:anchorId="60B37DEB" wp14:editId="0580835B">
+            <wp:extent cx="2486025" cy="5419725"/>
+            <wp:effectExtent l="0" t="0" r="9525" b="9525"/>
+            <wp:docPr id="15" name="Picture 15"/>
             <wp:cNvGraphicFramePr>
               <a:graphicFrameLocks xmlns:a="http://schemas.openxmlformats.org/drawingml/2006/main" noChangeAspect="1"/>
             </wp:cNvGraphicFramePr>
@@ -1810,7 +1772,7 @@
                   <pic:spPr>
                     <a:xfrm>
                       <a:off x="0" y="0"/>
-                      <a:ext cx="5943600" cy="3077845"/>
+                      <a:ext cx="2486025" cy="5419725"/>
                     </a:xfrm>
                     <a:prstGeom prst="rect">
                       <a:avLst/>
@@ -1833,13 +1795,48 @@
       </w:pPr>
       <w:r>
         <w:rPr>
+          <w:rFonts w:ascii="Times New Roman" w:hAnsi="Times New Roman" w:cs="Times New Roman"/>
+          <w:sz w:val="26"/>
+          <w:szCs w:val="26"/>
+        </w:rPr>
+        <w:br w:type="page"/>
+      </w:r>
+    </w:p>
+    <w:p>
+      <w:pPr>
+        <w:rPr>
+          <w:rFonts w:ascii="Times New Roman" w:hAnsi="Times New Roman" w:cs="Times New Roman"/>
+          <w:sz w:val="26"/>
+          <w:szCs w:val="26"/>
+        </w:rPr>
+      </w:pPr>
+      <w:r>
+        <w:rPr>
+          <w:rFonts w:ascii="Times New Roman" w:hAnsi="Times New Roman" w:cs="Times New Roman"/>
+          <w:sz w:val="26"/>
+          <w:szCs w:val="26"/>
+        </w:rPr>
+        <w:lastRenderedPageBreak/>
+        <w:t>Bổ sung:</w:t>
+      </w:r>
+    </w:p>
+    <w:p>
+      <w:pPr>
+        <w:rPr>
+          <w:rFonts w:ascii="Times New Roman" w:hAnsi="Times New Roman" w:cs="Times New Roman"/>
+          <w:sz w:val="26"/>
+          <w:szCs w:val="26"/>
+        </w:rPr>
+      </w:pPr>
+      <w:r>
+        <w:rPr>
           <w:noProof/>
         </w:rPr>
         <w:drawing>
-          <wp:inline distT="0" distB="0" distL="0" distR="0" wp14:anchorId="69091B28" wp14:editId="382DC351">
-            <wp:extent cx="5943600" cy="1222375"/>
-            <wp:effectExtent l="0" t="0" r="0" b="0"/>
-            <wp:docPr id="22" name="Picture 22"/>
+          <wp:inline distT="0" distB="0" distL="0" distR="0" wp14:anchorId="4E387D43" wp14:editId="3DDCED8E">
+            <wp:extent cx="5943600" cy="3077845"/>
+            <wp:effectExtent l="0" t="0" r="0" b="8255"/>
+            <wp:docPr id="21" name="Picture 21"/>
             <wp:cNvGraphicFramePr>
               <a:graphicFrameLocks xmlns:a="http://schemas.openxmlformats.org/drawingml/2006/main" noChangeAspect="1"/>
             </wp:cNvGraphicFramePr>
@@ -1859,6 +1856,55 @@
                   <pic:spPr>
                     <a:xfrm>
                       <a:off x="0" y="0"/>
+                      <a:ext cx="5943600" cy="3077845"/>
+                    </a:xfrm>
+                    <a:prstGeom prst="rect">
+                      <a:avLst/>
+                    </a:prstGeom>
+                  </pic:spPr>
+                </pic:pic>
+              </a:graphicData>
+            </a:graphic>
+          </wp:inline>
+        </w:drawing>
+      </w:r>
+    </w:p>
+    <w:p>
+      <w:pPr>
+        <w:rPr>
+          <w:rFonts w:ascii="Times New Roman" w:hAnsi="Times New Roman" w:cs="Times New Roman"/>
+          <w:sz w:val="26"/>
+          <w:szCs w:val="26"/>
+        </w:rPr>
+      </w:pPr>
+      <w:r>
+        <w:rPr>
+          <w:noProof/>
+        </w:rPr>
+        <w:drawing>
+          <wp:inline distT="0" distB="0" distL="0" distR="0" wp14:anchorId="69091B28" wp14:editId="382DC351">
+            <wp:extent cx="5943600" cy="1222375"/>
+            <wp:effectExtent l="0" t="0" r="0" b="0"/>
+            <wp:docPr id="22" name="Picture 22"/>
+            <wp:cNvGraphicFramePr>
+              <a:graphicFrameLocks xmlns:a="http://schemas.openxmlformats.org/drawingml/2006/main" noChangeAspect="1"/>
+            </wp:cNvGraphicFramePr>
+            <a:graphic xmlns:a="http://schemas.openxmlformats.org/drawingml/2006/main">
+              <a:graphicData uri="http://schemas.openxmlformats.org/drawingml/2006/picture">
+                <pic:pic xmlns:pic="http://schemas.openxmlformats.org/drawingml/2006/picture">
+                  <pic:nvPicPr>
+                    <pic:cNvPr id="1" name=""/>
+                    <pic:cNvPicPr/>
+                  </pic:nvPicPr>
+                  <pic:blipFill>
+                    <a:blip r:embed="rId21"/>
+                    <a:stretch>
+                      <a:fillRect/>
+                    </a:stretch>
+                  </pic:blipFill>
+                  <pic:spPr>
+                    <a:xfrm>
+                      <a:off x="0" y="0"/>
                       <a:ext cx="5943600" cy="1222375"/>
                     </a:xfrm>
                     <a:prstGeom prst="rect">
@@ -1873,8 +1919,8 @@
       </w:r>
     </w:p>
     <w:sectPr>
-      <w:headerReference w:type="default" r:id="rId21"/>
-      <w:footerReference w:type="default" r:id="rId22"/>
+      <w:headerReference w:type="default" r:id="rId22"/>
+      <w:footerReference w:type="default" r:id="rId23"/>
       <w:pgSz w:w="12240" w:h="15840"/>
       <w:pgMar w:top="1440" w:right="1440" w:bottom="1440" w:left="1440" w:header="720" w:footer="720" w:gutter="0"/>
       <w:cols w:space="720"/>
@@ -2476,6 +2522,29 @@
     <w:uiPriority w:val="99"/>
     <w:rsid w:val="00DE59B2"/>
   </w:style>
+  <w:style w:type="character" w:styleId="Hyperlink">
+    <w:name w:val="Hyperlink"/>
+    <w:basedOn w:val="DefaultParagraphFont"/>
+    <w:uiPriority w:val="99"/>
+    <w:unhideWhenUsed/>
+    <w:rsid w:val="00953543"/>
+    <w:rPr>
+      <w:color w:val="0563C1" w:themeColor="hyperlink"/>
+      <w:u w:val="single"/>
+    </w:rPr>
+  </w:style>
+  <w:style w:type="character" w:styleId="FollowedHyperlink">
+    <w:name w:val="FollowedHyperlink"/>
+    <w:basedOn w:val="DefaultParagraphFont"/>
+    <w:uiPriority w:val="99"/>
+    <w:semiHidden/>
+    <w:unhideWhenUsed/>
+    <w:rsid w:val="00953543"/>
+    <w:rPr>
+      <w:color w:val="954F72" w:themeColor="followedHyperlink"/>
+      <w:u w:val="single"/>
+    </w:rPr>
+  </w:style>
 </w:styles>
 </file>
 

</xml_diff>